<commit_message>
feat(contract): update template to V2
</commit_message>
<xml_diff>
--- a/public/assets/contrato_plantilla.docx
+++ b/public/assets/contrato_plantilla.docx
@@ -78,7 +78,7 @@
         <w:t>{{NOMBRE_CLIENTE}}</w:t>
       </w:r>
       <w:r>
-        <w:t xml:space="preserve">, mayor de edad, identificado con C.C. No. {{DOCUMENTO_CLIENTE}}, quien actúa en su propio nombre y representación, en adelante </w:t>
+        <w:t xml:space="preserve">, persona natural o jurídica identificada con NIT/CC No. {{DOCUMENTO_CLIENTE}}, en adelante </w:t>
       </w:r>
       <w:r>
         <w:rPr>
@@ -141,7 +141,13 @@
         <w:jc w:val="both"/>
       </w:pPr>
       <w:r>
-        <w:t>(ii) EL CONTRATANTE requiere los servicios de EL CONTRATISTA para un proyecto solar fotovoltaico residencial ubicado en {{DIRECCION_PROYECTO}}.</w:t>
+        <w:t xml:space="preserve">(ii) EL CONTRATANTE requiere los servicios de EL CONTRATISTA para un proyecto solar fotovoltaico ubicado en </w:t>
+      </w:r>
+      <w:r>
+        <w:t>{{DIRECCION_PROYECTO}}</w:t>
+      </w:r>
+      <w:r>
+        <w:t>.</w:t>
       </w:r>
     </w:p>
     <w:p>
@@ -181,7 +187,19 @@
         <w:t>PRIMERA. OBJETO Y ALCANCE.</w:t>
       </w:r>
       <w:r>
-        <w:t xml:space="preserve"> EL CONTRATISTA se obliga, de manera independiente y con sus propios recursos técnicos, financieros y administrativos, a ejecutar el diseño, suministro, instalación con certificación RETIE y legalización ante el operador de red, del sistema solar fotovoltaico de EL CONTRATANTE en {{DIRECCION_PROYECTO}}, conforme al alcance, especificaciones y cronograma establecidos en la Propuesta Comercial del {{FECHA_FIRMA}}, que se incorpora como Anexo 1 y hace parte integral de este Contrato.</w:t>
+        <w:t xml:space="preserve"> EL CONTRATISTA se obliga, de manera independiente y con sus propios recursos técnicos, financieros y administrativos, a ejecutar el diseño, suministro, instalación con </w:t>
+      </w:r>
+      <w:r>
+        <w:t>declaración de cumplimiento</w:t>
+      </w:r>
+      <w:r>
+        <w:t xml:space="preserve"> RETIE y legalización ante el operador de red, del sistema solar fotovoltaico de EL CONTRATANTE en </w:t>
+      </w:r>
+      <w:r>
+        <w:t>{{DIRECCION_PROYECTO}}</w:t>
+      </w:r>
+      <w:r>
+        <w:t>, conforme al alcance, especificaciones y cronograma establecidos en la Propuesta Comercial del {{FECHA_FIRMA}}, que se incorpora como Anexo 1 y hace parte integral de este Contrato.</w:t>
       </w:r>
     </w:p>
     <w:p>
@@ -287,24 +305,13 @@
         <w:jc w:val="both"/>
       </w:pPr>
       <w:r>
-        <w:t>5% al momento de la entrega d</w:t>
-      </w:r>
-      <w:r>
-        <w:t>e la legalizac</w:t>
-      </w:r>
-      <w:proofErr w:type="spellStart"/>
+        <w:t>5% al momento de la entrega de la legalizac</w:t>
+      </w:r>
       <w:r>
         <w:rPr>
           <w:lang w:val="es-ES_tradnl"/>
         </w:rPr>
-        <w:t>ión</w:t>
-      </w:r>
-      <w:proofErr w:type="spellEnd"/>
-      <w:r>
-        <w:rPr>
-          <w:lang w:val="es-ES_tradnl"/>
-        </w:rPr>
-        <w:t xml:space="preserve"> ante el OR</w:t>
+        <w:t>ión ante el OR</w:t>
       </w:r>
       <w:r>
         <w:t>.</w:t>
@@ -382,7 +389,10 @@
         <w:jc w:val="both"/>
       </w:pPr>
       <w:r>
-        <w:t>Tramitar la certificación RETIE y la legalización ante el operador de red.</w:t>
+        <w:t xml:space="preserve">Tramitar la certificación RETIE </w:t>
+      </w:r>
+      <w:r>
+        <w:t xml:space="preserve">o declaración de cumplimiento, según aplique. </w:t>
       </w:r>
     </w:p>
     <w:p>
@@ -396,7 +406,10 @@
         <w:jc w:val="both"/>
       </w:pPr>
       <w:r>
-        <w:t>Reportar oportunamente cualquier dificultad o causa ajena que pueda afectar el cumplimiento.</w:t>
+        <w:t>L</w:t>
+      </w:r>
+      <w:r>
+        <w:t>egalización ante el operador de red.</w:t>
       </w:r>
     </w:p>
     <w:p>
@@ -410,29 +423,7 @@
         <w:jc w:val="both"/>
       </w:pPr>
       <w:r>
-        <w:t>Mantener vigentes durante la ejecución</w:t>
-      </w:r>
-      <w:r>
-        <w:t xml:space="preserve"> </w:t>
-      </w:r>
-      <w:r>
-        <w:t>la afiliación al sistema de seguridad social de su personal en obra.</w:t>
-      </w:r>
-    </w:p>
-    <w:p>
-      <w:pPr>
-        <w:spacing w:before="180" w:after="120"/>
-        <w:jc w:val="both"/>
-      </w:pPr>
-      <w:r>
-        <w:rPr>
-          <w:b/>
-          <w:bCs/>
-        </w:rPr>
-        <w:t>SEXTA. OBLIGACIONES DE EL CONTRATANTE.</w:t>
-      </w:r>
-      <w:r>
-        <w:t xml:space="preserve"> </w:t>
+        <w:t>Reportar oportunamente cualquier dificultad o causa ajena que pueda afectar el cumplimiento.</w:t>
       </w:r>
     </w:p>
     <w:p>
@@ -446,7 +437,23 @@
         <w:jc w:val="both"/>
       </w:pPr>
       <w:r>
-        <w:t>Pagar el valor del Contrato en los términos pactados.</w:t>
+        <w:t>Mantener vigentes durante la ejecución la afiliación al sistema de seguridad social de su personal en obra.</w:t>
+      </w:r>
+    </w:p>
+    <w:p>
+      <w:pPr>
+        <w:spacing w:before="180" w:after="120"/>
+        <w:jc w:val="both"/>
+      </w:pPr>
+      <w:r>
+        <w:rPr>
+          <w:b/>
+          <w:bCs/>
+        </w:rPr>
+        <w:t>SEXTA. OBLIGACIONES DE EL CONTRATANTE.</w:t>
+      </w:r>
+      <w:r>
+        <w:t xml:space="preserve"> </w:t>
       </w:r>
     </w:p>
     <w:p>
@@ -460,7 +467,7 @@
         <w:jc w:val="both"/>
       </w:pPr>
       <w:r>
-        <w:t>Permitir el acceso oportuno al inmueble y suministrar la información, documentación y servicios públicos necesarios para la ejecución.</w:t>
+        <w:t>Pagar el valor del Contrato en los términos pactados.</w:t>
       </w:r>
     </w:p>
     <w:p>
@@ -474,7 +481,7 @@
         <w:jc w:val="both"/>
       </w:pPr>
       <w:r>
-        <w:t>Garantizar la idoneidad estructural del inmueble para soportar el sistema fotovoltaico, así como la integridad de sus instalaciones eléctricas preexistentes.</w:t>
+        <w:t>Permitir el acceso oportuno al inmueble y suministrar la información, documentación y servicios públicos necesarios para la ejecución.</w:t>
       </w:r>
     </w:p>
     <w:p>
@@ -488,23 +495,7 @@
         <w:jc w:val="both"/>
       </w:pPr>
       <w:r>
-        <w:t>Atender oportunamente requerimientos de aprobación o información, suyos o de terceros (operador de red, interventores, organismos de inspección).</w:t>
-      </w:r>
-    </w:p>
-    <w:p>
-      <w:pPr>
-        <w:spacing w:before="180" w:after="120"/>
-        <w:jc w:val="both"/>
-      </w:pPr>
-      <w:r>
-        <w:rPr>
-          <w:b/>
-          <w:bCs/>
-        </w:rPr>
-        <w:t>SÉPTIMA. GARANTÍAS.</w:t>
-      </w:r>
-      <w:r>
-        <w:t xml:space="preserve"> EL CONTRATISTA otorga las siguientes garantías a partir de la suscripción del acta de entrega del sistema:</w:t>
+        <w:t>Garantizar la idoneidad estructural del inmueble para soportar el sistema fotovoltaico, así como la integridad de sus instalaciones eléctricas preexistentes.</w:t>
       </w:r>
     </w:p>
     <w:p>
@@ -518,7 +509,23 @@
         <w:jc w:val="both"/>
       </w:pPr>
       <w:r>
-        <w:t>Mano de obra e instalación: doce (12) meses.</w:t>
+        <w:t>Atender oportunamente requerimientos de aprobación o información, suyos o de terceros (operador de red, interventores, organismos de inspección).</w:t>
+      </w:r>
+    </w:p>
+    <w:p>
+      <w:pPr>
+        <w:spacing w:before="180" w:after="120"/>
+        <w:jc w:val="both"/>
+      </w:pPr>
+      <w:r>
+        <w:rPr>
+          <w:b/>
+          <w:bCs/>
+        </w:rPr>
+        <w:t>SÉPTIMA. GARANTÍAS.</w:t>
+      </w:r>
+      <w:r>
+        <w:t xml:space="preserve"> EL CONTRATISTA otorga las siguientes garantías a partir de la suscripción del acta de entrega del sistema:</w:t>
       </w:r>
     </w:p>
     <w:p>
@@ -532,7 +539,7 @@
         <w:jc w:val="both"/>
       </w:pPr>
       <w:r>
-        <w:t>Estructura de soporte: cinco (5) años.</w:t>
+        <w:t>Mano de obra e instalación: doce (12) meses.</w:t>
       </w:r>
     </w:p>
     <w:p>
@@ -546,6 +553,20 @@
         <w:jc w:val="both"/>
       </w:pPr>
       <w:r>
+        <w:t>Estructura de soporte: cinco (5) años.</w:t>
+      </w:r>
+    </w:p>
+    <w:p>
+      <w:pPr>
+        <w:pStyle w:val="ListParagraph"/>
+        <w:numPr>
+          <w:ilvl w:val="0"/>
+          <w:numId w:val="2"/>
+        </w:numPr>
+        <w:spacing w:before="30" w:after="30"/>
+        <w:jc w:val="both"/>
+      </w:pPr>
+      <w:r>
         <w:t>Módulos fotovoltaicos e inversor: garantía del fabricante, cuyos términos y mecanismos de reclamación se entregarán a EL CONTRATANTE junto con los demás entregables.</w:t>
       </w:r>
     </w:p>
@@ -587,7 +608,13 @@
         <w:t>OCTAVA. ENTREGABLES Y PROPIEDAD INTELECTUAL.</w:t>
       </w:r>
       <w:r>
-        <w:t xml:space="preserve"> Al finalizar la prestación del servicio, EL CONTRATISTA entregará a EL CONTRATANTE: (i) planos de diseño, (ii) memorias de cálculo, (iii) certificado RETIE de instalación y equipos, (iv) sistema fotovoltaico legalizado ante las entidades competentes, y (v) acceso al monitoreo digital de generación. Los derechos de propiedad intelectual sobre las metodologías, herramientas y conocimientos técnicos de EL CONTRATISTA permanecen en cabeza suya. La propiedad de los entregables anteriores y del sistema instalado se transfiere a EL CONTRATANTE.</w:t>
+        <w:t xml:space="preserve"> Al finalizar la prestación del servicio, EL CONTRATISTA entregará a EL CONTRATANTE: (i) planos de diseño, (ii) memorias de cálculo, (iii) certificado RETIE </w:t>
+      </w:r>
+      <w:r>
+        <w:t xml:space="preserve">o declaración de cumplimiento </w:t>
+      </w:r>
+      <w:r>
+        <w:t>de instalación y equipos, (iv) sistema fotovoltaico legalizado ante las entidades competentes, y (v) acceso al monitoreo digital de generación. Los derechos de propiedad intelectual sobre las metodologías, herramientas y conocimientos técnicos de EL CONTRATISTA permanecen en cabeza suya. La propiedad de los entregables anteriores y del sistema instalado se transfiere a EL CONTRATANTE.</w:t>
       </w:r>
     </w:p>
     <w:p>
@@ -603,11 +630,11 @@
         <w:t>NOVENA. INDEPENDENCIA LABORAL.</w:t>
       </w:r>
       <w:r>
-        <w:t xml:space="preserve"> EL CONTRATISTA actúa como contratista independiente, con plena autonomía técnica, administrativa y financiera. No existe vínculo laboral ni subordinación entre EL CONTRATANTE y el personal de EL CONTRATISTA o sus </w:t>
+        <w:t xml:space="preserve"> EL CONTRATISTA actúa como contratista independiente, con plena autonomía técnica, administrativa y financiera. No existe vínculo laboral </w:t>
       </w:r>
       <w:r>
         <w:lastRenderedPageBreak/>
-        <w:t>subcontratistas. Cada Parte asume las obligaciones laborales, prestacionales y de seguridad social respecto de su propio personal y mantendrá indemne a la otra frente a reclamaciones de tales personas.</w:t>
+        <w:t>ni subordinación entre EL CONTRATANTE y el personal de EL CONTRATISTA o sus subcontratistas. Cada Parte asume las obligaciones laborales, prestacionales y de seguridad social respecto de su propio personal y mantendrá indemne a la otra frente a reclamaciones de tales personas.</w:t>
       </w:r>
     </w:p>
     <w:p>
@@ -732,14 +759,11 @@
           <w:b/>
           <w:bCs/>
         </w:rPr>
+        <w:lastRenderedPageBreak/>
         <w:t>DÉCIMA SÉPTIMA. PREVENCIÓN LA/FT.</w:t>
       </w:r>
       <w:r>
-        <w:t xml:space="preserve"> Las Partes declaran que sus recursos provienen de actividades lícitas y se obligan a cumplir la normativa colombiana en prevención de lavado de </w:t>
-      </w:r>
-      <w:r>
-        <w:lastRenderedPageBreak/>
-        <w:t>activos y financiación del terrorismo. El incumplimiento de esta cláusula faculta a la Parte cumplida para terminar el Contrato de inmediato, sin lugar a indemnización.</w:t>
+        <w:t xml:space="preserve"> Las Partes declaran que sus recursos provienen de actividades lícitas y se obligan a cumplir la normativa colombiana en prevención de lavado de activos y financiación del terrorismo. El incumplimiento de esta cláusula faculta a la Parte cumplida para terminar el Contrato de inmediato, sin lugar a indemnización.</w:t>
       </w:r>
     </w:p>
     <w:p>
@@ -990,7 +1014,7 @@
               <w:jc w:val="center"/>
             </w:pPr>
             <w:r>
-              <w:t>C.C. {{DOCUMENTO_CLIENTE}}</w:t>
+              <w:t>NIT/CC {{DOCUMENTO_CLIENTE}}</w:t>
             </w:r>
           </w:p>
         </w:tc>
@@ -1036,7 +1060,7 @@
                 <wp:inline distT="0" distB="0" distL="0" distR="0" wp14:anchorId="17DE6F48" wp14:editId="65532394">
                   <wp:extent cx="1585568" cy="881380"/>
                   <wp:effectExtent l="0" t="0" r="2540" b="0"/>
-                  <wp:docPr id="1938684393" name="Picture 2" descr="A signature on a white background&#10;&#10;AI-generated content may be incorrect."/>
+                  <wp:docPr id="1938684393" name="Picture 2" descr="A signature on a white background  AI-generated content may be incorrect."/>
                   <wp:cNvGraphicFramePr>
                     <a:graphicFrameLocks xmlns:a="http://schemas.openxmlformats.org/drawingml/2006/main" noChangeAspect="1"/>
                   </wp:cNvGraphicFramePr>
@@ -1044,7 +1068,7 @@
                     <a:graphicData uri="http://schemas.openxmlformats.org/drawingml/2006/picture">
                       <pic:pic xmlns:pic="http://schemas.openxmlformats.org/drawingml/2006/picture">
                         <pic:nvPicPr>
-                          <pic:cNvPr id="1938684393" name="Picture 2" descr="A signature on a white background&#10;&#10;AI-generated content may be incorrect."/>
+                          <pic:cNvPr id="1938684393" name="Picture 2" descr="A signature on a white background  AI-generated content may be incorrect."/>
                           <pic:cNvPicPr/>
                         </pic:nvPicPr>
                         <pic:blipFill>

</xml_diff>